<commit_message>
WIP: agents in progress
Co-Authored-By: Claude Sonnet 5.5 <noreply@anthropic.com>
Claude-Session: https://claude.ai/code/session_01NYgB3ju57UwWRpkPPM6X7F
</commit_message>
<xml_diff>
--- a/hp/Math_Inquirers_P1_Question_Bank.docx
+++ b/hp/Math_Inquirers_P1_Question_Bank.docx
@@ -3095,7 +3095,7 @@
           <w:sz w:val="23"/>
           <w:szCs w:val="23"/>
         </w:rPr>
-        <w:t xml:space="preserve">□ + □ + 4 = 20, and both boxes are the same number. What is in the box?</w:t>
+        <w:t xml:space="preserve">A + A + 4 = 20, and the two As stand for the same number. What number is A?</w:t>
       </w:r>
     </w:p>
     <w:p>
@@ -4153,7 +4153,7 @@
           <w:sz w:val="23"/>
           <w:szCs w:val="23"/>
         </w:rPr>
-        <w:t xml:space="preserve">Key: ● = 2 children. Apple ●●●, Banana ●●●●●, Orange ●●. How many more chose banana than orange?</w:t>
+        <w:t xml:space="preserve">Each picture stands for 2 children. Apple has 3 pictures, banana has 5 and orange has 2. How many more children chose banana than orange?</w:t>
       </w:r>
     </w:p>
     <w:p>

</xml_diff>

<commit_message>
P6 fix pass (safeguarding revert pending)
Co-Authored-By: Claude Sonnet 5.5 <noreply@anthropic.com>
Claude-Session: https://claude.ai/code/session_01NYgB3ju57UwWRpkPPM6X7F
</commit_message>
<xml_diff>
--- a/hp/Math_Inquirers_P1_Question_Bank.docx
+++ b/hp/Math_Inquirers_P1_Question_Bank.docx
@@ -168,7 +168,7 @@
           <w:sz w:val="24"/>
           <w:szCs w:val="24"/>
         </w:rPr>
-        <w:t xml:space="preserve">CHALLENGE questions are for children who have finished the topic. They need the lesson idea plus an extension: more than one step, finding every way, working backwards, justifying an answer, changing one thing and asking what happens, or making up a puzzle of their own. Open questions have no single right answer; check the reasoning. This uses low-floor, high-ceiling task ideas and problem-solving habits from gifted-education research. It does not identify gifted children, it is not an official GEP standard, and this program is not affiliated with MOE.</w:t>
+        <w:t xml:space="preserve">GO FURTHER questions are for any child who chooses them after the topic. They need the lesson idea plus an extension: more than one step, finding every way, working backwards, justifying an answer, changing one thing and asking what happens, or making up a puzzle of their own. Open questions have no single right answer; check the reasoning. This uses low-floor, high-ceiling task ideas and problem-solving habits from enrichment research. It does not label children, it is not an official GEP standard, and this program is not affiliated with MOE.</w:t>
       </w:r>
     </w:p>
     <w:p>
@@ -1905,7 +1905,7 @@
           <w:sz w:val="23"/>
           <w:szCs w:val="23"/>
         </w:rPr>
-        <w:t xml:space="preserve">Start at 50 and take away 7 each time. What is the first number below 20?</w:t>
+        <w:t xml:space="preserve">Ali counts in 2s from 2 up to 50. Mei counts in 5s from 5 up to 50. Which numbers do both of them say? What do you notice?</w:t>
       </w:r>
     </w:p>
     <w:p>
@@ -7195,7 +7195,7 @@
           <w:sz w:val="23"/>
           <w:szCs w:val="23"/>
         </w:rPr>
-        <w:t xml:space="preserve">How many ways can you make 25¢ using 20¢, 10¢ and 5¢ coins?</w:t>
+        <w:t xml:space="preserve">Find ALL the ways to make 30¢ using 20¢, 10¢ and 5¢ coins. How do you know you have found them all?</w:t>
       </w:r>
     </w:p>
     <w:p>
@@ -11829,7 +11829,7 @@
           <w:sz w:val="20"/>
           <w:szCs w:val="20"/>
         </w:rPr>
-        <w:t xml:space="preserve">15 (50, 43, 36, 29, 22, 15).</w:t>
+        <w:t xml:space="preserve">10, 20, 30, 40 and 50. They all end in 0.</w:t>
       </w:r>
     </w:p>
     <w:p>
@@ -16039,7 +16039,7 @@
           <w:sz w:val="20"/>
           <w:szCs w:val="20"/>
         </w:rPr>
-        <w:t xml:space="preserve">4 ways. (20+5; 10+10+5; 10+5+5+5; 5+5+5+5+5)</w:t>
+        <w:t xml:space="preserve">6 ways: 20+10; 20+5+5; 10+10+10; 10+10+5+5; 10+5+5+5+5; six 5¢. Start with the biggest coin and work down.</w:t>
       </w:r>
     </w:p>
     <w:p>

</xml_diff>

<commit_message>
Parent pack tier wording; rebuild Question Banks and Weekly Dose packs for all levels
Co-Authored-By: Claude Sonnet 5.5 <noreply@anthropic.com>
Claude-Session: https://claude.ai/code/session_01Wmstm4fTDLXm5Z35vo5Mv2
</commit_message>
<xml_diff>
--- a/hp/Math_Inquirers_P1_Question_Bank.docx
+++ b/hp/Math_Inquirers_P1_Question_Bank.docx
@@ -19382,8 +19382,32 @@
         <w:szCs w:val="18"/>
       </w:rPr>
       <w:fldChar w:fldCharType="begin"/>
+    </w:r>
+    <w:r>
+      <w:rPr>
+        <w:rFonts w:ascii="Arial" w:cs="Arial" w:eastAsia="Arial" w:hAnsi="Arial"/>
+        <w:color w:val="777777"/>
+        <w:sz w:val="18"/>
+        <w:szCs w:val="18"/>
+      </w:rPr>
       <w:instrText xml:space="preserve">PAGE</w:instrText>
+    </w:r>
+    <w:r>
+      <w:rPr>
+        <w:rFonts w:ascii="Arial" w:cs="Arial" w:eastAsia="Arial" w:hAnsi="Arial"/>
+        <w:color w:val="777777"/>
+        <w:sz w:val="18"/>
+        <w:szCs w:val="18"/>
+      </w:rPr>
       <w:fldChar w:fldCharType="separate"/>
+    </w:r>
+    <w:r>
+      <w:rPr>
+        <w:rFonts w:ascii="Arial" w:cs="Arial" w:eastAsia="Arial" w:hAnsi="Arial"/>
+        <w:color w:val="777777"/>
+        <w:sz w:val="18"/>
+        <w:szCs w:val="18"/>
+      </w:rPr>
       <w:fldChar w:fldCharType="end"/>
     </w:r>
   </w:p>
@@ -19537,6 +19561,21 @@
   <w:style w:type="paragraph" w:styleId="Normal" w:default="1">
     <w:name w:val="Normal"/>
     <w:qFormat/>
+  </w:style>
+  <w:style w:type="table" w:styleId="TableNormal" w:default="true">
+    <w:name w:val="Normal Table"/>
+    <w:uiPriority w:val="99"/>
+    <w:semiHidden/>
+    <w:unhideWhenUsed/>
+    <w:tblPr>
+      <w:tblInd w:type="dxa" w:w="0"/>
+      <w:tblCellMar>
+        <w:top w:type="dxa" w:w="0"/>
+        <w:left w:type="dxa" w:w="108"/>
+        <w:bottom w:type="dxa" w:w="0"/>
+        <w:right w:type="dxa" w:w="108"/>
+      </w:tblCellMar>
+    </w:tblPr>
   </w:style>
   <w:style w:type="paragraph" w:styleId="Title">
     <w:name w:val="Title"/>

</xml_diff>

<commit_message>
WIP: fix passes and timing audits in progress
Co-Authored-By: Claude Sonnet 5.5 <noreply@anthropic.com>
Claude-Session: https://claude.ai/code/session_01Wmstm4fTDLXm5Z35vo5Mv2
</commit_message>
<xml_diff>
--- a/hp/Math_Inquirers_P1_Question_Bank.docx
+++ b/hp/Math_Inquirers_P1_Question_Bank.docx
@@ -123,7 +123,7 @@
           <w:sz w:val="24"/>
           <w:szCs w:val="24"/>
         </w:rPr>
-        <w:t xml:space="preserve">Each lesson has three levels. Every child starts with Core, then moves up when they are ready. Challenge questions are the ones to talk about together.</w:t>
+        <w:t xml:space="preserve">Each lesson has three levels. Every child may start with Core, and any child may choose Think harder or Go further at any time. Nobody is placed in a level. Go further questions are good ones to talk about together.</w:t>
       </w:r>
     </w:p>
     <w:p>
@@ -138,7 +138,7 @@
           <w:sz w:val="24"/>
           <w:szCs w:val="24"/>
         </w:rPr>
-        <w:t xml:space="preserve">CORE questions are low floor: a child who has not yet learnt the topic can start them with objects, a drawing, counting or guess-and-check. No special method is needed. Use them for warm-ups and for children who need confidence.</w:t>
+        <w:t xml:space="preserve">CORE questions are low floor: a child who has not yet learnt the topic can start them with objects, a drawing, counting or guess-and-check. No special method is needed. Use them for warm-ups and for a confident start for every child.</w:t>
       </w:r>
     </w:p>
     <w:p>
@@ -2237,7 +2237,7 @@
                 <w:sz w:val="26"/>
                 <w:szCs w:val="26"/>
               </w:rPr>
-              <w:t xml:space="preserve">CHALLENGE (after the topic: extend, justify, make up your own)</w:t>
+              <w:t xml:space="preserve">GO FURTHER (after the topic: extend, justify, make up your own)</w:t>
             </w:r>
           </w:p>
         </w:tc>
@@ -3361,7 +3361,7 @@
                 <w:sz w:val="26"/>
                 <w:szCs w:val="26"/>
               </w:rPr>
-              <w:t xml:space="preserve">CHALLENGE (after the topic: extend, justify, make up your own)</w:t>
+              <w:t xml:space="preserve">GO FURTHER (after the topic: extend, justify, make up your own)</w:t>
             </w:r>
           </w:p>
         </w:tc>
@@ -4320,7 +4320,7 @@
                 <w:sz w:val="26"/>
                 <w:szCs w:val="26"/>
               </w:rPr>
-              <w:t xml:space="preserve">CHALLENGE (after the topic: extend, justify, make up your own)</w:t>
+              <w:t xml:space="preserve">GO FURTHER (after the topic: extend, justify, make up your own)</w:t>
             </w:r>
           </w:p>
         </w:tc>
@@ -5444,7 +5444,7 @@
                 <w:sz w:val="26"/>
                 <w:szCs w:val="26"/>
               </w:rPr>
-              <w:t xml:space="preserve">CHALLENGE (after the topic: extend, justify, make up your own)</w:t>
+              <w:t xml:space="preserve">GO FURTHER (after the topic: extend, justify, make up your own)</w:t>
             </w:r>
           </w:p>
         </w:tc>
@@ -6436,7 +6436,7 @@
                 <w:sz w:val="26"/>
                 <w:szCs w:val="26"/>
               </w:rPr>
-              <w:t xml:space="preserve">CHALLENGE (after the topic: extend, justify, make up your own)</w:t>
+              <w:t xml:space="preserve">GO FURTHER (after the topic: extend, justify, make up your own)</w:t>
             </w:r>
           </w:p>
         </w:tc>
@@ -6959,7 +6959,7 @@
           <w:sz w:val="23"/>
           <w:szCs w:val="23"/>
         </w:rPr>
-        <w:t xml:space="preserve">Pay exactly $15 with the fewest notes. The notes are $2, $5, $10 and $50. (Use play notes.)</w:t>
+        <w:t xml:space="preserve">Pay exactly 60¢ with the fewest coins from 5¢, 10¢, 20¢ and 50¢. (Use play coins.)</w:t>
       </w:r>
     </w:p>
     <w:p>
@@ -6992,7 +6992,7 @@
           <w:sz w:val="23"/>
           <w:szCs w:val="23"/>
         </w:rPr>
-        <w:t xml:space="preserve">Pay exactly $17 with the fewest notes from $2, $5 and $10. Which notes do you use?</w:t>
+        <w:t xml:space="preserve">Pay exactly 35¢ using 20¢, 10¢ and 5¢ coins. Use play coins and find a way with 3 coins.</w:t>
       </w:r>
     </w:p>
     <w:p>
@@ -7461,7 +7461,7 @@
                 <w:sz w:val="26"/>
                 <w:szCs w:val="26"/>
               </w:rPr>
-              <w:t xml:space="preserve">CHALLENGE (after the topic: extend, justify, make up your own)</w:t>
+              <w:t xml:space="preserve">GO FURTHER (after the topic: extend, justify, make up your own)</w:t>
             </w:r>
           </w:p>
         </w:tc>
@@ -8420,7 +8420,7 @@
                 <w:sz w:val="26"/>
                 <w:szCs w:val="26"/>
               </w:rPr>
-              <w:t xml:space="preserve">CHALLENGE (after the topic: extend, justify, make up your own)</w:t>
+              <w:t xml:space="preserve">GO FURTHER (after the topic: extend, justify, make up your own)</w:t>
             </w:r>
           </w:p>
         </w:tc>
@@ -8555,7 +8555,7 @@
           <w:sz w:val="23"/>
           <w:szCs w:val="23"/>
         </w:rPr>
-        <w:t xml:space="preserve">A triangle has 4 lines drawn from the top corner to the bottom. How many triangles are there? Follow the pattern 3, 6, 10 … What would 5 lines give?</w:t>
+        <w:t xml:space="preserve">A big triangle has lines drawn from its top corner to the bottom. With 1 line there are 3 triangles, with 2 lines 6, with 3 lines 10. How many triangles with 4 lines? With 5 lines? Draw it to check.</w:t>
       </w:r>
     </w:p>
     <w:p>
@@ -8588,7 +8588,7 @@
           <w:sz w:val="23"/>
           <w:szCs w:val="23"/>
         </w:rPr>
-        <w:t xml:space="preserve">A square is cut into 4 equal squares. One of the small squares is cut into 4 even smaller squares. How many squares can you find altogether?</w:t>
+        <w:t xml:space="preserve">Draw a square and cut it into 4 equal squares. Then cut ONE of those small squares into 4 even smaller squares. How many squares can you find altogether? Count the small ones first, then the bigger ones.</w:t>
       </w:r>
     </w:p>
     <w:p>
@@ -9379,7 +9379,7 @@
                 <w:sz w:val="26"/>
                 <w:szCs w:val="26"/>
               </w:rPr>
-              <w:t xml:space="preserve">CHALLENGE (after the topic: extend, justify, make up your own)</w:t>
+              <w:t xml:space="preserve">GO FURTHER (after the topic: extend, justify, make up your own)</w:t>
             </w:r>
           </w:p>
         </w:tc>
@@ -10371,7 +10371,7 @@
                 <w:sz w:val="26"/>
                 <w:szCs w:val="26"/>
               </w:rPr>
-              <w:t xml:space="preserve">CHALLENGE (after the topic: extend, justify, make up your own)</w:t>
+              <w:t xml:space="preserve">GO FURTHER (after the topic: extend, justify, make up your own)</w:t>
             </w:r>
           </w:p>
         </w:tc>
@@ -11264,7 +11264,7 @@
                 <w:sz w:val="26"/>
                 <w:szCs w:val="26"/>
               </w:rPr>
-              <w:t xml:space="preserve">CHALLENGE (after the topic: extend, justify, make up your own)</w:t>
+              <w:t xml:space="preserve">GO FURTHER (after the topic: extend, justify, make up your own)</w:t>
             </w:r>
           </w:p>
         </w:tc>
@@ -15874,7 +15874,7 @@
           <w:sz w:val="20"/>
           <w:szCs w:val="20"/>
         </w:rPr>
-        <w:t xml:space="preserve">$10 + $5 (2 notes)</w:t>
+        <w:t xml:space="preserve">50¢ + 10¢ (2 coins)</w:t>
       </w:r>
     </w:p>
     <w:p>
@@ -15907,7 +15907,7 @@
           <w:sz w:val="20"/>
           <w:szCs w:val="20"/>
         </w:rPr>
-        <w:t xml:space="preserve">$10 + $5 + $2 (3 notes)</w:t>
+        <w:t xml:space="preserve">20¢ + 10¢ + 5¢ (3 coins)</w:t>
       </w:r>
     </w:p>
     <w:p>
@@ -17112,7 +17112,7 @@
           <w:sz w:val="20"/>
           <w:szCs w:val="20"/>
         </w:rPr>
-        <w:t xml:space="preserve">15 triangles with 4 lines, and 21 with 5 lines (add 2, 3, 4, 5, 6 each time).</w:t>
+        <w:t xml:space="preserve">15 triangles with 4 lines and 21 with 5 lines. The number added grows by 1 each time: 3, 6, 10, 15, 21 (+3, +4, +5, +6). Check by drawing: count the small triangles first, then the bigger ones made of 2, 3 … small ones.</w:t>
       </w:r>
     </w:p>
     <w:p>

</xml_diff>

<commit_message>
WIP: round-2 content audit fixes (Level 6 done)
Co-Authored-By: Claude Sonnet 5.5 <noreply@anthropic.com>
Claude-Session: https://claude.ai/code/session_01NYgB3ju57UwWRpkPPM6X7F
</commit_message>
<xml_diff>
--- a/hp/Math_Inquirers_P1_Question_Bank.docx
+++ b/hp/Math_Inquirers_P1_Question_Bank.docx
@@ -4488,7 +4488,7 @@
           <w:sz w:val="23"/>
           <w:szCs w:val="23"/>
         </w:rPr>
-        <w:t xml:space="preserve">24 children voted. Apple got 6 votes. Orange got 6 more votes than banana. How many votes did banana and orange get?</w:t>
+        <w:t xml:space="preserve">24 children voted for three fruits: apple, banana and orange. Apple got 6 votes. Orange got 6 more votes than banana. How many votes did banana and orange get?</w:t>
       </w:r>
     </w:p>
     <w:p>
@@ -8154,73 +8154,73 @@
           <w:sz w:val="23"/>
           <w:szCs w:val="23"/>
         </w:rPr>
+        <w:t xml:space="preserve">Three squares are joined in a row to make a long rectangle. How many rectangles can you find altogether? (A square counts as a rectangle.)</w:t>
+      </w:r>
+    </w:p>
+    <w:p>
+      <w:pPr>
+        <w:keepLines/>
+        <w:spacing w:after="60" w:before="60" w:line="290" w:lineRule="auto"/>
+        <w:ind w:left="640" w:hanging="640"/>
+      </w:pPr>
+      <w:r>
+        <w:rPr>
+          <w:rFonts w:ascii="Arial" w:cs="Arial" w:eastAsia="Arial" w:hAnsi="Arial"/>
+          <w:b/>
+          <w:bCs/>
+          <w:sz w:val="23"/>
+          <w:szCs w:val="23"/>
+        </w:rPr>
+        <w:t xml:space="preserve">S4.</w:t>
+      </w:r>
+      <w:r>
+        <w:rPr>
+          <w:rFonts w:ascii="Arial" w:cs="Arial" w:eastAsia="Arial" w:hAnsi="Arial"/>
+          <w:sz w:val="23"/>
+          <w:szCs w:val="23"/>
+        </w:rPr>
+        <w:tab/>
+      </w:r>
+      <w:r>
+        <w:rPr>
+          <w:rFonts w:ascii="Arial" w:cs="Arial" w:eastAsia="Arial" w:hAnsi="Arial"/>
+          <w:sz w:val="23"/>
+          <w:szCs w:val="23"/>
+        </w:rPr>
+        <w:t xml:space="preserve">Draw a shape with 4 straight sides that is NOT a square. Is it a rectangle? How do you know?</w:t>
+      </w:r>
+    </w:p>
+    <w:p>
+      <w:pPr>
+        <w:keepLines/>
+        <w:spacing w:after="60" w:before="60" w:line="290" w:lineRule="auto"/>
+        <w:ind w:left="640" w:hanging="640"/>
+      </w:pPr>
+      <w:r>
+        <w:rPr>
+          <w:rFonts w:ascii="Arial" w:cs="Arial" w:eastAsia="Arial" w:hAnsi="Arial"/>
+          <w:b/>
+          <w:bCs/>
+          <w:sz w:val="23"/>
+          <w:szCs w:val="23"/>
+        </w:rPr>
+        <w:t xml:space="preserve">S5.</w:t>
+      </w:r>
+      <w:r>
+        <w:rPr>
+          <w:rFonts w:ascii="Arial" w:cs="Arial" w:eastAsia="Arial" w:hAnsi="Arial"/>
+          <w:sz w:val="23"/>
+          <w:szCs w:val="23"/>
+        </w:rPr>
+        <w:tab/>
+      </w:r>
+      <w:r>
+        <w:rPr>
+          <w:rFonts w:ascii="Arial" w:cs="Arial" w:eastAsia="Arial" w:hAnsi="Arial"/>
+          <w:sz w:val="23"/>
+          <w:szCs w:val="23"/>
+        </w:rPr>
         <w:t xml:space="preserve">A square has both diagonals drawn (lines joining opposite corners). How many triangles can you find? Count the small ones first.</w:t>
-      </w:r>
-    </w:p>
-    <w:p>
-      <w:pPr>
-        <w:keepLines/>
-        <w:spacing w:after="60" w:before="60" w:line="290" w:lineRule="auto"/>
-        <w:ind w:left="640" w:hanging="640"/>
-      </w:pPr>
-      <w:r>
-        <w:rPr>
-          <w:rFonts w:ascii="Arial" w:cs="Arial" w:eastAsia="Arial" w:hAnsi="Arial"/>
-          <w:b/>
-          <w:bCs/>
-          <w:sz w:val="23"/>
-          <w:szCs w:val="23"/>
-        </w:rPr>
-        <w:t xml:space="preserve">S4.</w:t>
-      </w:r>
-      <w:r>
-        <w:rPr>
-          <w:rFonts w:ascii="Arial" w:cs="Arial" w:eastAsia="Arial" w:hAnsi="Arial"/>
-          <w:sz w:val="23"/>
-          <w:szCs w:val="23"/>
-        </w:rPr>
-        <w:tab/>
-      </w:r>
-      <w:r>
-        <w:rPr>
-          <w:rFonts w:ascii="Arial" w:cs="Arial" w:eastAsia="Arial" w:hAnsi="Arial"/>
-          <w:sz w:val="23"/>
-          <w:szCs w:val="23"/>
-        </w:rPr>
-        <w:t xml:space="preserve">Draw a shape with 4 straight sides that is NOT a square. Is it a rectangle? How do you know?</w:t>
-      </w:r>
-    </w:p>
-    <w:p>
-      <w:pPr>
-        <w:keepLines/>
-        <w:spacing w:after="60" w:before="60" w:line="290" w:lineRule="auto"/>
-        <w:ind w:left="640" w:hanging="640"/>
-      </w:pPr>
-      <w:r>
-        <w:rPr>
-          <w:rFonts w:ascii="Arial" w:cs="Arial" w:eastAsia="Arial" w:hAnsi="Arial"/>
-          <w:b/>
-          <w:bCs/>
-          <w:sz w:val="23"/>
-          <w:szCs w:val="23"/>
-        </w:rPr>
-        <w:t xml:space="preserve">S5.</w:t>
-      </w:r>
-      <w:r>
-        <w:rPr>
-          <w:rFonts w:ascii="Arial" w:cs="Arial" w:eastAsia="Arial" w:hAnsi="Arial"/>
-          <w:sz w:val="23"/>
-          <w:szCs w:val="23"/>
-        </w:rPr>
-        <w:tab/>
-      </w:r>
-      <w:r>
-        <w:rPr>
-          <w:rFonts w:ascii="Arial" w:cs="Arial" w:eastAsia="Arial" w:hAnsi="Arial"/>
-          <w:sz w:val="23"/>
-          <w:szCs w:val="23"/>
-        </w:rPr>
-        <w:t xml:space="preserve">Three squares are joined in a row to make a long rectangle. How many rectangles can you find altogether? (A square counts as a rectangle.)</w:t>
       </w:r>
     </w:p>
     <w:p>
@@ -10828,7 +10828,7 @@
           <w:sz w:val="23"/>
           <w:szCs w:val="23"/>
         </w:rPr>
-        <w:t xml:space="preserve">How many sides does a hexagon have? (Draw one if you like.)</w:t>
+        <w:t xml:space="preserve">How many sides and how many corners does a rectangle have? (Draw one if you like.)</w:t>
       </w:r>
     </w:p>
     <w:p>
@@ -16782,73 +16782,73 @@
           <w:sz w:val="20"/>
           <w:szCs w:val="20"/>
         </w:rPr>
+        <w:t xml:space="preserve">6 (3 single squares, 2 pairs and 1 whole row).</w:t>
+      </w:r>
+    </w:p>
+    <w:p>
+      <w:pPr>
+        <w:keepLines/>
+        <w:spacing w:after="20" w:before="20" w:line="260" w:lineRule="auto"/>
+        <w:ind w:left="640" w:hanging="640"/>
+      </w:pPr>
+      <w:r>
+        <w:rPr>
+          <w:rFonts w:ascii="Arial" w:cs="Arial" w:eastAsia="Arial" w:hAnsi="Arial"/>
+          <w:b/>
+          <w:bCs/>
+          <w:sz w:val="20"/>
+          <w:szCs w:val="20"/>
+        </w:rPr>
+        <w:t xml:space="preserve">S4.</w:t>
+      </w:r>
+      <w:r>
+        <w:rPr>
+          <w:rFonts w:ascii="Arial" w:cs="Arial" w:eastAsia="Arial" w:hAnsi="Arial"/>
+          <w:sz w:val="20"/>
+          <w:szCs w:val="20"/>
+        </w:rPr>
+        <w:tab/>
+      </w:r>
+      <w:r>
+        <w:rPr>
+          <w:rFonts w:ascii="Arial" w:cs="Arial" w:eastAsia="Arial" w:hAnsi="Arial"/>
+          <w:sz w:val="20"/>
+          <w:szCs w:val="20"/>
+        </w:rPr>
+        <w:t xml:space="preserve">Open. A long rectangle has 4 square corners, so it is a rectangle. A slanted shape with 4 sides does not have square corners, so it is not a rectangle.</w:t>
+      </w:r>
+    </w:p>
+    <w:p>
+      <w:pPr>
+        <w:keepLines/>
+        <w:spacing w:after="20" w:before="20" w:line="260" w:lineRule="auto"/>
+        <w:ind w:left="640" w:hanging="640"/>
+      </w:pPr>
+      <w:r>
+        <w:rPr>
+          <w:rFonts w:ascii="Arial" w:cs="Arial" w:eastAsia="Arial" w:hAnsi="Arial"/>
+          <w:b/>
+          <w:bCs/>
+          <w:sz w:val="20"/>
+          <w:szCs w:val="20"/>
+        </w:rPr>
+        <w:t xml:space="preserve">S5.</w:t>
+      </w:r>
+      <w:r>
+        <w:rPr>
+          <w:rFonts w:ascii="Arial" w:cs="Arial" w:eastAsia="Arial" w:hAnsi="Arial"/>
+          <w:sz w:val="20"/>
+          <w:szCs w:val="20"/>
+        </w:rPr>
+        <w:tab/>
+      </w:r>
+      <w:r>
+        <w:rPr>
+          <w:rFonts w:ascii="Arial" w:cs="Arial" w:eastAsia="Arial" w:hAnsi="Arial"/>
+          <w:sz w:val="20"/>
+          <w:szCs w:val="20"/>
+        </w:rPr>
         <w:t xml:space="preserve">8 (4 small + 4 made of two small ones)</w:t>
-      </w:r>
-    </w:p>
-    <w:p>
-      <w:pPr>
-        <w:keepLines/>
-        <w:spacing w:after="20" w:before="20" w:line="260" w:lineRule="auto"/>
-        <w:ind w:left="640" w:hanging="640"/>
-      </w:pPr>
-      <w:r>
-        <w:rPr>
-          <w:rFonts w:ascii="Arial" w:cs="Arial" w:eastAsia="Arial" w:hAnsi="Arial"/>
-          <w:b/>
-          <w:bCs/>
-          <w:sz w:val="20"/>
-          <w:szCs w:val="20"/>
-        </w:rPr>
-        <w:t xml:space="preserve">S4.</w:t>
-      </w:r>
-      <w:r>
-        <w:rPr>
-          <w:rFonts w:ascii="Arial" w:cs="Arial" w:eastAsia="Arial" w:hAnsi="Arial"/>
-          <w:sz w:val="20"/>
-          <w:szCs w:val="20"/>
-        </w:rPr>
-        <w:tab/>
-      </w:r>
-      <w:r>
-        <w:rPr>
-          <w:rFonts w:ascii="Arial" w:cs="Arial" w:eastAsia="Arial" w:hAnsi="Arial"/>
-          <w:sz w:val="20"/>
-          <w:szCs w:val="20"/>
-        </w:rPr>
-        <w:t xml:space="preserve">Open. A long rectangle has 4 square corners, so it is a rectangle. A slanted shape with 4 sides does not have square corners, so it is not a rectangle.</w:t>
-      </w:r>
-    </w:p>
-    <w:p>
-      <w:pPr>
-        <w:keepLines/>
-        <w:spacing w:after="20" w:before="20" w:line="260" w:lineRule="auto"/>
-        <w:ind w:left="640" w:hanging="640"/>
-      </w:pPr>
-      <w:r>
-        <w:rPr>
-          <w:rFonts w:ascii="Arial" w:cs="Arial" w:eastAsia="Arial" w:hAnsi="Arial"/>
-          <w:b/>
-          <w:bCs/>
-          <w:sz w:val="20"/>
-          <w:szCs w:val="20"/>
-        </w:rPr>
-        <w:t xml:space="preserve">S5.</w:t>
-      </w:r>
-      <w:r>
-        <w:rPr>
-          <w:rFonts w:ascii="Arial" w:cs="Arial" w:eastAsia="Arial" w:hAnsi="Arial"/>
-          <w:sz w:val="20"/>
-          <w:szCs w:val="20"/>
-        </w:rPr>
-        <w:tab/>
-      </w:r>
-      <w:r>
-        <w:rPr>
-          <w:rFonts w:ascii="Arial" w:cs="Arial" w:eastAsia="Arial" w:hAnsi="Arial"/>
-          <w:sz w:val="20"/>
-          <w:szCs w:val="20"/>
-        </w:rPr>
-        <w:t xml:space="preserve">6 (3 single squares, 2 pairs and 1 whole row).</w:t>
       </w:r>
     </w:p>
     <w:p>
@@ -18879,7 +18879,7 @@
           <w:sz w:val="20"/>
           <w:szCs w:val="20"/>
         </w:rPr>
-        <w:t xml:space="preserve">6</w:t>
+        <w:t xml:space="preserve">4 sides and 4 corners</w:t>
       </w:r>
     </w:p>
     <w:p>

</xml_diff>